<commit_message>
chore: restructure interview Q&A with weighted categories and new briefs
- Restructure data.json with priority weights and prep_priority tags
- Add new interview study documents (7-dimension roadmap, click ghost card)
- Update resume files
</commit_message>
<xml_diff>
--- a/简历/交易所修改/王鹏-测试工程师-7年-本科-j.docx
+++ b/简历/交易所修改/王鹏-测试工程师-7年-本科-j.docx
@@ -618,7 +618,26 @@
           <w:sz w:val="20"/>
           <w:szCs w:val="20"/>
         </w:rPr>
-        <w:t>性能与安全测试：基于JMeter+top完成高并发性能测试与系统资源监控。具备安全测试与UAT验收经验，管理跨部门测试资源与版本交付</w:t>
+        <w:t>性能</w:t>
+      </w:r>
+      <w:r>
+        <w:rPr>
+          <w:rFonts w:hint="eastAsia" w:ascii="宋体" w:hAnsi="宋体" w:eastAsia="宋体" w:cs="宋体"/>
+          <w:sz w:val="20"/>
+          <w:szCs w:val="20"/>
+          <w:lang w:val="en-US" w:eastAsia="zh-CN"/>
+        </w:rPr>
+        <w:t>与管理</w:t>
+      </w:r>
+      <w:bookmarkStart w:id="0" w:name="_GoBack"/>
+      <w:bookmarkEnd w:id="0"/>
+      <w:r>
+        <w:rPr>
+          <w:rFonts w:hint="eastAsia" w:ascii="宋体" w:hAnsi="宋体" w:eastAsia="宋体" w:cs="宋体"/>
+          <w:sz w:val="20"/>
+          <w:szCs w:val="20"/>
+        </w:rPr>
+        <w:t>：基于JMeter+top完成高并发性能测试与系统资源监控。管理跨部门测试资源与版本交付</w:t>
       </w:r>
     </w:p>
     <w:p>
@@ -1760,8 +1779,6 @@
         </w:rPr>
         <w:t xml:space="preserve">本科    软件工程           </w:t>
       </w:r>
-      <w:bookmarkStart w:id="0" w:name="_GoBack"/>
-      <w:bookmarkEnd w:id="0"/>
     </w:p>
     <w:p>
       <w:pPr>

</xml_diff>

<commit_message>
chore: update interview Q&A with weighted categories and new briefs
- Refactor data.json with weighted scoring and reorganized categories
- Update interview-1.json with supplementary questions
- Add reflection/复盘 styles and refined dual-file loading in HTML
- Update resumes (docx) with latest role descriptions
- Add tavily test results and server utility
- Add Gate.io responsibility description and AI test platform resume
</commit_message>
<xml_diff>
--- a/简历/交易所修改/王鹏-测试工程师-7年-本科-j.docx
+++ b/简历/交易所修改/王鹏-测试工程师-7年-本科-j.docx
@@ -444,6 +444,18 @@
         </w:rPr>
         <w:t>核心技能</w:t>
       </w:r>
+      <w:r>
+        <w:rPr>
+          <w:rFonts w:hint="eastAsia" w:ascii="微软雅黑" w:hAnsi="微软雅黑" w:eastAsia="微软雅黑" w:cs="微软雅黑"/>
+          <w:b/>
+          <w:bCs/>
+          <w:spacing w:val="-6"/>
+          <w:sz w:val="30"/>
+          <w:szCs w:val="30"/>
+          <w:lang w:val="en-US" w:eastAsia="zh-CN"/>
+        </w:rPr>
+        <w:tab/>
+      </w:r>
     </w:p>
     <w:p>
       <w:pPr>
@@ -596,56 +608,6 @@
           <w:ilvl w:val="0"/>
           <w:numId w:val="0"/>
         </w:numPr>
-        <w:spacing w:after="40" w:line="360" w:lineRule="exact"/>
-        <w:ind w:leftChars="0"/>
-        <w:rPr>
-          <w:rFonts w:hint="eastAsia" w:ascii="宋体" w:hAnsi="宋体" w:eastAsia="宋体" w:cs="宋体"/>
-          <w:sz w:val="20"/>
-          <w:szCs w:val="20"/>
-        </w:rPr>
-      </w:pPr>
-      <w:r>
-        <w:rPr>
-          <w:rFonts w:ascii="宋体" w:hAnsi="宋体"/>
-          <w:sz w:val="20"/>
-          <w:szCs w:val="20"/>
-        </w:rPr>
-        <w:t xml:space="preserve">▸ </w:t>
-      </w:r>
-      <w:r>
-        <w:rPr>
-          <w:rFonts w:hint="eastAsia" w:ascii="宋体" w:hAnsi="宋体" w:eastAsia="宋体" w:cs="宋体"/>
-          <w:sz w:val="20"/>
-          <w:szCs w:val="20"/>
-        </w:rPr>
-        <w:t>性能</w:t>
-      </w:r>
-      <w:r>
-        <w:rPr>
-          <w:rFonts w:hint="eastAsia" w:ascii="宋体" w:hAnsi="宋体" w:eastAsia="宋体" w:cs="宋体"/>
-          <w:sz w:val="20"/>
-          <w:szCs w:val="20"/>
-          <w:lang w:val="en-US" w:eastAsia="zh-CN"/>
-        </w:rPr>
-        <w:t>与管理</w:t>
-      </w:r>
-      <w:bookmarkStart w:id="0" w:name="_GoBack"/>
-      <w:bookmarkEnd w:id="0"/>
-      <w:r>
-        <w:rPr>
-          <w:rFonts w:hint="eastAsia" w:ascii="宋体" w:hAnsi="宋体" w:eastAsia="宋体" w:cs="宋体"/>
-          <w:sz w:val="20"/>
-          <w:szCs w:val="20"/>
-        </w:rPr>
-        <w:t>：基于JMeter+top完成高并发性能测试与系统资源监控。管理跨部门测试资源与版本交付</w:t>
-      </w:r>
-    </w:p>
-    <w:p>
-      <w:pPr>
-        <w:numPr>
-          <w:ilvl w:val="0"/>
-          <w:numId w:val="0"/>
-        </w:numPr>
         <w:spacing w:line="321" w:lineRule="auto"/>
         <w:ind w:leftChars="0"/>
         <w:rPr>
@@ -1060,7 +1022,26 @@
           <w:sz w:val="20"/>
           <w:szCs w:val="20"/>
         </w:rPr>
-        <w:t>▸ 实现AI赋能全流程闭环，NLP缺陷智能分析准确率达80%+，对接CI/CD质量门禁后线上漏测率下降35%</w:t>
+        <w:t>▸ 实现AI赋能全流程闭环，NLP缺陷智能分析准确率达80%+，对接CI/CD质量门禁后线上漏测率下降</w:t>
+      </w:r>
+      <w:r>
+        <w:rPr>
+          <w:rFonts w:hint="eastAsia" w:ascii="宋体" w:hAnsi="宋体" w:eastAsia="宋体" w:cs="宋体"/>
+          <w:sz w:val="20"/>
+          <w:szCs w:val="20"/>
+          <w:lang w:val="en-US" w:eastAsia="zh-CN"/>
+        </w:rPr>
+        <w:t>3</w:t>
+      </w:r>
+      <w:bookmarkStart w:id="0" w:name="_GoBack"/>
+      <w:bookmarkEnd w:id="0"/>
+      <w:r>
+        <w:rPr>
+          <w:rFonts w:hint="eastAsia" w:ascii="宋体" w:hAnsi="宋体" w:eastAsia="宋体" w:cs="宋体"/>
+          <w:sz w:val="20"/>
+          <w:szCs w:val="20"/>
+        </w:rPr>
+        <w:t>5%</w:t>
       </w:r>
     </w:p>
     <w:p>

</xml_diff>